<commit_message>
mailmerge doc wikkelschema.docx conditioneel gemaakt
</commit_message>
<xml_diff>
--- a/Win32/Release/templates/doc/wikkelschema.docx
+++ b/Win32/Release/templates/doc/wikkelschema.docx
@@ -10,13 +10,13 @@
         <w:tblLook w:val="04A0" w:firstRow="1" w:lastRow="0" w:firstColumn="1" w:lastColumn="0" w:noHBand="0" w:noVBand="1"/>
       </w:tblPr>
       <w:tblGrid>
-        <w:gridCol w:w="4606"/>
-        <w:gridCol w:w="4606"/>
+        <w:gridCol w:w="4522"/>
+        <w:gridCol w:w="4540"/>
       </w:tblGrid>
       <w:tr>
         <w:tc>
           <w:tcPr>
-            <w:tcW w:w="4606" w:type="dxa"/>
+            <w:tcW w:w="4522" w:type="dxa"/>
             <w:shd w:val="clear" w:color="auto" w:fill="BFBFBF" w:themeFill="background1" w:themeFillShade="BF"/>
           </w:tcPr>
           <w:p>
@@ -37,7 +37,7 @@
         </w:tc>
         <w:tc>
           <w:tcPr>
-            <w:tcW w:w="4606" w:type="dxa"/>
+            <w:tcW w:w="4540" w:type="dxa"/>
             <w:shd w:val="clear" w:color="auto" w:fill="BFBFBF" w:themeFill="background1" w:themeFillShade="BF"/>
           </w:tcPr>
           <w:p>
@@ -54,7 +54,7 @@
       <w:tr>
         <w:tc>
           <w:tcPr>
-            <w:tcW w:w="4606" w:type="dxa"/>
+            <w:tcW w:w="4522" w:type="dxa"/>
             <w:shd w:val="clear" w:color="auto" w:fill="D9D9D9" w:themeFill="background1" w:themeFillShade="D9"/>
           </w:tcPr>
           <w:p>
@@ -65,7 +65,7 @@
         </w:tc>
         <w:tc>
           <w:tcPr>
-            <w:tcW w:w="4606" w:type="dxa"/>
+            <w:tcW w:w="4540" w:type="dxa"/>
             <w:shd w:val="clear" w:color="auto" w:fill="FFFFFF" w:themeFill="background1"/>
           </w:tcPr>
           <w:p>
@@ -86,7 +86,7 @@
       <w:tr>
         <w:tc>
           <w:tcPr>
-            <w:tcW w:w="4606" w:type="dxa"/>
+            <w:tcW w:w="4522" w:type="dxa"/>
             <w:shd w:val="clear" w:color="auto" w:fill="D9D9D9" w:themeFill="background1" w:themeFillShade="D9"/>
           </w:tcPr>
           <w:p>
@@ -97,7 +97,7 @@
         </w:tc>
         <w:tc>
           <w:tcPr>
-            <w:tcW w:w="4606" w:type="dxa"/>
+            <w:tcW w:w="4540" w:type="dxa"/>
             <w:shd w:val="clear" w:color="auto" w:fill="FFFFFF" w:themeFill="background1"/>
           </w:tcPr>
           <w:p>
@@ -109,7 +109,7 @@
                 <w:rPr>
                   <w:noProof/>
                 </w:rPr>
-                <w:t>3,80</w:t>
+                <w:t>3,8</w:t>
               </w:r>
             </w:fldSimple>
           </w:p>
@@ -118,7 +118,7 @@
       <w:tr>
         <w:tc>
           <w:tcPr>
-            <w:tcW w:w="4606" w:type="dxa"/>
+            <w:tcW w:w="4522" w:type="dxa"/>
             <w:shd w:val="clear" w:color="auto" w:fill="D9D9D9" w:themeFill="background1" w:themeFillShade="D9"/>
           </w:tcPr>
           <w:p>
@@ -138,7 +138,7 @@
         </w:tc>
         <w:tc>
           <w:tcPr>
-            <w:tcW w:w="4606" w:type="dxa"/>
+            <w:tcW w:w="4540" w:type="dxa"/>
             <w:shd w:val="clear" w:color="auto" w:fill="FFFFFF" w:themeFill="background1"/>
           </w:tcPr>
           <w:p>
@@ -159,7 +159,7 @@
       <w:tr>
         <w:tc>
           <w:tcPr>
-            <w:tcW w:w="4606" w:type="dxa"/>
+            <w:tcW w:w="4522" w:type="dxa"/>
             <w:shd w:val="clear" w:color="auto" w:fill="D9D9D9" w:themeFill="background1" w:themeFillShade="D9"/>
           </w:tcPr>
           <w:p>
@@ -170,7 +170,7 @@
         </w:tc>
         <w:tc>
           <w:tcPr>
-            <w:tcW w:w="4606" w:type="dxa"/>
+            <w:tcW w:w="4540" w:type="dxa"/>
             <w:shd w:val="clear" w:color="auto" w:fill="FFFFFF" w:themeFill="background1"/>
           </w:tcPr>
           <w:p>
@@ -191,7 +191,7 @@
       <w:tr>
         <w:tc>
           <w:tcPr>
-            <w:tcW w:w="4606" w:type="dxa"/>
+            <w:tcW w:w="4522" w:type="dxa"/>
             <w:shd w:val="clear" w:color="auto" w:fill="D9D9D9" w:themeFill="background1" w:themeFillShade="D9"/>
           </w:tcPr>
           <w:p>
@@ -202,7 +202,7 @@
         </w:tc>
         <w:tc>
           <w:tcPr>
-            <w:tcW w:w="4606" w:type="dxa"/>
+            <w:tcW w:w="4540" w:type="dxa"/>
             <w:shd w:val="clear" w:color="auto" w:fill="FFFFFF" w:themeFill="background1"/>
           </w:tcPr>
           <w:p>
@@ -223,7 +223,7 @@
       <w:tr>
         <w:tc>
           <w:tcPr>
-            <w:tcW w:w="4606" w:type="dxa"/>
+            <w:tcW w:w="4522" w:type="dxa"/>
             <w:shd w:val="clear" w:color="auto" w:fill="D9D9D9" w:themeFill="background1" w:themeFillShade="D9"/>
           </w:tcPr>
           <w:p>
@@ -234,7 +234,7 @@
         </w:tc>
         <w:tc>
           <w:tcPr>
-            <w:tcW w:w="4606" w:type="dxa"/>
+            <w:tcW w:w="4540" w:type="dxa"/>
             <w:shd w:val="clear" w:color="auto" w:fill="FFFFFF" w:themeFill="background1"/>
           </w:tcPr>
           <w:p>
@@ -255,7 +255,7 @@
       <w:tr>
         <w:tc>
           <w:tcPr>
-            <w:tcW w:w="4606" w:type="dxa"/>
+            <w:tcW w:w="4522" w:type="dxa"/>
             <w:shd w:val="clear" w:color="auto" w:fill="D9D9D9" w:themeFill="background1" w:themeFillShade="D9"/>
           </w:tcPr>
           <w:p>
@@ -266,7 +266,7 @@
         </w:tc>
         <w:tc>
           <w:tcPr>
-            <w:tcW w:w="4606" w:type="dxa"/>
+            <w:tcW w:w="4540" w:type="dxa"/>
             <w:shd w:val="clear" w:color="auto" w:fill="FFFFFF" w:themeFill="background1"/>
           </w:tcPr>
           <w:p>
@@ -287,27 +287,27 @@
       <w:tr>
         <w:tc>
           <w:tcPr>
-            <w:tcW w:w="4606" w:type="dxa"/>
+            <w:tcW w:w="4522" w:type="dxa"/>
             <w:shd w:val="clear" w:color="auto" w:fill="D9D9D9" w:themeFill="background1" w:themeFillShade="D9"/>
           </w:tcPr>
           <w:p/>
         </w:tc>
         <w:tc>
           <w:tcPr>
-            <w:tcW w:w="4606" w:type="dxa"/>
-            <w:shd w:val="clear" w:color="auto" w:fill="FFFFFF" w:themeFill="background1"/>
-          </w:tcPr>
-          <w:p>
-            <w:pPr>
-              <w:jc w:val="right"/>
-            </w:pPr>
-          </w:p>
-        </w:tc>
-      </w:tr>
-      <w:tr>
-        <w:tc>
-          <w:tcPr>
-            <w:tcW w:w="4606" w:type="dxa"/>
+            <w:tcW w:w="4540" w:type="dxa"/>
+            <w:shd w:val="clear" w:color="auto" w:fill="FFFFFF" w:themeFill="background1"/>
+          </w:tcPr>
+          <w:p>
+            <w:pPr>
+              <w:jc w:val="right"/>
+            </w:pPr>
+          </w:p>
+        </w:tc>
+      </w:tr>
+      <w:tr>
+        <w:tc>
+          <w:tcPr>
+            <w:tcW w:w="4522" w:type="dxa"/>
             <w:shd w:val="clear" w:color="auto" w:fill="D9D9D9" w:themeFill="background1" w:themeFillShade="D9"/>
           </w:tcPr>
           <w:p>
@@ -318,7 +318,7 @@
         </w:tc>
         <w:tc>
           <w:tcPr>
-            <w:tcW w:w="4606" w:type="dxa"/>
+            <w:tcW w:w="4540" w:type="dxa"/>
             <w:shd w:val="clear" w:color="auto" w:fill="FFFFFF" w:themeFill="background1"/>
           </w:tcPr>
           <w:p>
@@ -339,7 +339,7 @@
       <w:tr>
         <w:tc>
           <w:tcPr>
-            <w:tcW w:w="4606" w:type="dxa"/>
+            <w:tcW w:w="4522" w:type="dxa"/>
             <w:shd w:val="clear" w:color="auto" w:fill="D9D9D9" w:themeFill="background1" w:themeFillShade="D9"/>
           </w:tcPr>
           <w:p>
@@ -350,7 +350,7 @@
         </w:tc>
         <w:tc>
           <w:tcPr>
-            <w:tcW w:w="4606" w:type="dxa"/>
+            <w:tcW w:w="4540" w:type="dxa"/>
             <w:shd w:val="clear" w:color="auto" w:fill="FFFFFF" w:themeFill="background1"/>
           </w:tcPr>
           <w:p>
@@ -371,7 +371,7 @@
       <w:tr>
         <w:tc>
           <w:tcPr>
-            <w:tcW w:w="4606" w:type="dxa"/>
+            <w:tcW w:w="4522" w:type="dxa"/>
             <w:shd w:val="clear" w:color="auto" w:fill="D9D9D9" w:themeFill="background1" w:themeFillShade="D9"/>
           </w:tcPr>
           <w:p>
@@ -382,7 +382,7 @@
         </w:tc>
         <w:tc>
           <w:tcPr>
-            <w:tcW w:w="4606" w:type="dxa"/>
+            <w:tcW w:w="4540" w:type="dxa"/>
             <w:shd w:val="clear" w:color="auto" w:fill="FFFFFF" w:themeFill="background1"/>
           </w:tcPr>
           <w:p>
@@ -403,7 +403,7 @@
       <w:tr>
         <w:tc>
           <w:tcPr>
-            <w:tcW w:w="4606" w:type="dxa"/>
+            <w:tcW w:w="4522" w:type="dxa"/>
             <w:shd w:val="clear" w:color="auto" w:fill="D9D9D9" w:themeFill="background1" w:themeFillShade="D9"/>
           </w:tcPr>
           <w:p>
@@ -414,7 +414,7 @@
         </w:tc>
         <w:tc>
           <w:tcPr>
-            <w:tcW w:w="4606" w:type="dxa"/>
+            <w:tcW w:w="4540" w:type="dxa"/>
             <w:shd w:val="clear" w:color="auto" w:fill="FFFFFF" w:themeFill="background1"/>
           </w:tcPr>
           <w:p>
@@ -435,7 +435,7 @@
       <w:tr>
         <w:tc>
           <w:tcPr>
-            <w:tcW w:w="4606" w:type="dxa"/>
+            <w:tcW w:w="4522" w:type="dxa"/>
             <w:shd w:val="clear" w:color="auto" w:fill="D9D9D9" w:themeFill="background1" w:themeFillShade="D9"/>
           </w:tcPr>
           <w:p>
@@ -446,7 +446,7 @@
         </w:tc>
         <w:tc>
           <w:tcPr>
-            <w:tcW w:w="4606" w:type="dxa"/>
+            <w:tcW w:w="4540" w:type="dxa"/>
             <w:shd w:val="clear" w:color="auto" w:fill="FFFFFF" w:themeFill="background1"/>
           </w:tcPr>
           <w:p>
@@ -458,7 +458,7 @@
                 <w:rPr>
                   <w:noProof/>
                 </w:rPr>
-                <w:t>0,20</w:t>
+                <w:t>0,2</w:t>
               </w:r>
             </w:fldSimple>
           </w:p>
@@ -467,7 +467,7 @@
       <w:tr>
         <w:tc>
           <w:tcPr>
-            <w:tcW w:w="4606" w:type="dxa"/>
+            <w:tcW w:w="4522" w:type="dxa"/>
             <w:shd w:val="clear" w:color="auto" w:fill="D9D9D9" w:themeFill="background1" w:themeFillShade="D9"/>
           </w:tcPr>
           <w:p>
@@ -478,28 +478,70 @@
         </w:tc>
         <w:tc>
           <w:tcPr>
-            <w:tcW w:w="4606" w:type="dxa"/>
-            <w:shd w:val="clear" w:color="auto" w:fill="FFFFFF" w:themeFill="background1"/>
-          </w:tcPr>
-          <w:p>
-            <w:pPr>
-              <w:jc w:val="right"/>
-            </w:pPr>
+            <w:tcW w:w="4540" w:type="dxa"/>
+            <w:shd w:val="clear" w:color="auto" w:fill="FFFFFF" w:themeFill="background1"/>
+          </w:tcPr>
+          <w:p>
+            <w:pPr>
+              <w:jc w:val="right"/>
+            </w:pPr>
+            <w:r>
+              <w:fldChar w:fldCharType="begin"/>
+            </w:r>
+            <w:r>
+              <w:instrText xml:space="preserve"> IF </w:instrText>
+            </w:r>
             <w:fldSimple w:instr=" MERGEFIELD fiftyVoltTap ">
               <w:r>
                 <w:rPr>
                   <w:noProof/>
                 </w:rPr>
-                <w:t>0</w:t>
+                <w:instrText>100</w:instrText>
               </w:r>
             </w:fldSimple>
-          </w:p>
-        </w:tc>
-      </w:tr>
-      <w:tr>
-        <w:tc>
-          <w:tcPr>
-            <w:tcW w:w="4606" w:type="dxa"/>
+            <w:r>
+              <w:instrText xml:space="preserve"> = 0 "nvt" </w:instrText>
+            </w:r>
+            <w:r>
+              <w:fldChar w:fldCharType="begin"/>
+            </w:r>
+            <w:r>
+              <w:instrText xml:space="preserve"> MERGEFIELD fiftyVoltTap </w:instrText>
+            </w:r>
+            <w:r>
+              <w:fldChar w:fldCharType="separate"/>
+            </w:r>
+            <w:r>
+              <w:rPr>
+                <w:noProof/>
+              </w:rPr>
+              <w:instrText>100</w:instrText>
+            </w:r>
+            <w:r>
+              <w:fldChar w:fldCharType="end"/>
+            </w:r>
+            <w:r>
+              <w:instrText xml:space="preserve"> </w:instrText>
+            </w:r>
+            <w:r>
+              <w:fldChar w:fldCharType="separate"/>
+            </w:r>
+            <w:r>
+              <w:rPr>
+                <w:noProof/>
+              </w:rPr>
+              <w:t>100</w:t>
+            </w:r>
+            <w:r>
+              <w:fldChar w:fldCharType="end"/>
+            </w:r>
+          </w:p>
+        </w:tc>
+      </w:tr>
+      <w:tr>
+        <w:tc>
+          <w:tcPr>
+            <w:tcW w:w="4522" w:type="dxa"/>
             <w:shd w:val="clear" w:color="auto" w:fill="D9D9D9" w:themeFill="background1" w:themeFillShade="D9"/>
           </w:tcPr>
           <w:p>
@@ -510,48 +552,75 @@
         </w:tc>
         <w:tc>
           <w:tcPr>
-            <w:tcW w:w="4606" w:type="dxa"/>
-            <w:shd w:val="clear" w:color="auto" w:fill="FFFFFF" w:themeFill="background1"/>
-          </w:tcPr>
-          <w:p>
-            <w:pPr>
-              <w:jc w:val="right"/>
-            </w:pPr>
+            <w:tcW w:w="4540" w:type="dxa"/>
+            <w:shd w:val="clear" w:color="auto" w:fill="FFFFFF" w:themeFill="background1"/>
+          </w:tcPr>
+          <w:p>
+            <w:pPr>
+              <w:jc w:val="right"/>
+            </w:pPr>
+            <w:r>
+              <w:fldChar w:fldCharType="begin"/>
+            </w:r>
+            <w:r>
+              <w:instrText xml:space="preserve"> IF </w:instrText>
+            </w:r>
             <w:fldSimple w:instr=" MERGEFIELD secCenterTap ">
               <w:r>
                 <w:rPr>
                   <w:noProof/>
                 </w:rPr>
-                <w:t>0</w:t>
+                <w:instrText>0</w:instrText>
               </w:r>
             </w:fldSimple>
-          </w:p>
-        </w:tc>
-      </w:tr>
-      <w:tr>
-        <w:tc>
-          <w:tcPr>
-            <w:tcW w:w="4606" w:type="dxa"/>
+            <w:r>
+              <w:instrText xml:space="preserve"> = 0 "nvt" "</w:instrText>
+            </w:r>
+            <w:r>
+              <w:instrText>0</w:instrText>
+            </w:r>
+            <w:r>
+              <w:instrText xml:space="preserve">" </w:instrText>
+            </w:r>
+            <w:r>
+              <w:fldChar w:fldCharType="separate"/>
+            </w:r>
+            <w:r>
+              <w:rPr>
+                <w:noProof/>
+              </w:rPr>
+              <w:t>nvt</w:t>
+            </w:r>
+            <w:r>
+              <w:fldChar w:fldCharType="end"/>
+            </w:r>
+          </w:p>
+        </w:tc>
+      </w:tr>
+      <w:tr>
+        <w:tc>
+          <w:tcPr>
+            <w:tcW w:w="4522" w:type="dxa"/>
             <w:shd w:val="clear" w:color="auto" w:fill="D9D9D9" w:themeFill="background1" w:themeFillShade="D9"/>
           </w:tcPr>
           <w:p/>
         </w:tc>
         <w:tc>
           <w:tcPr>
-            <w:tcW w:w="4606" w:type="dxa"/>
-            <w:shd w:val="clear" w:color="auto" w:fill="FFFFFF" w:themeFill="background1"/>
-          </w:tcPr>
-          <w:p>
-            <w:pPr>
-              <w:jc w:val="right"/>
-            </w:pPr>
-          </w:p>
-        </w:tc>
-      </w:tr>
-      <w:tr>
-        <w:tc>
-          <w:tcPr>
-            <w:tcW w:w="4606" w:type="dxa"/>
+            <w:tcW w:w="4540" w:type="dxa"/>
+            <w:shd w:val="clear" w:color="auto" w:fill="FFFFFF" w:themeFill="background1"/>
+          </w:tcPr>
+          <w:p>
+            <w:pPr>
+              <w:jc w:val="right"/>
+            </w:pPr>
+          </w:p>
+        </w:tc>
+      </w:tr>
+      <w:tr>
+        <w:tc>
+          <w:tcPr>
+            <w:tcW w:w="4522" w:type="dxa"/>
             <w:shd w:val="clear" w:color="auto" w:fill="D9D9D9" w:themeFill="background1" w:themeFillShade="D9"/>
           </w:tcPr>
           <w:p>
@@ -560,30 +629,59 @@
             </w:r>
           </w:p>
         </w:tc>
-        <w:tc>
-          <w:tcPr>
-            <w:tcW w:w="4606" w:type="dxa"/>
-            <w:shd w:val="clear" w:color="auto" w:fill="FFFFFF" w:themeFill="background1"/>
-          </w:tcPr>
-          <w:p>
-            <w:pPr>
-              <w:jc w:val="right"/>
-            </w:pPr>
+        <w:bookmarkStart w:id="0" w:name="_Hlk226628863"/>
+        <w:tc>
+          <w:tcPr>
+            <w:tcW w:w="4540" w:type="dxa"/>
+            <w:shd w:val="clear" w:color="auto" w:fill="FFFFFF" w:themeFill="background1"/>
+          </w:tcPr>
+          <w:p>
+            <w:pPr>
+              <w:jc w:val="right"/>
+            </w:pPr>
+            <w:r>
+              <w:fldChar w:fldCharType="begin"/>
+            </w:r>
+            <w:r>
+              <w:instrText xml:space="preserve"> IF </w:instrText>
+            </w:r>
             <w:fldSimple w:instr=" MERGEFIELD fiveVoltVA ">
               <w:r>
                 <w:rPr>
                   <w:noProof/>
                 </w:rPr>
-                <w:t>15</w:t>
+                <w:instrText>15</w:instrText>
               </w:r>
             </w:fldSimple>
-          </w:p>
-        </w:tc>
-      </w:tr>
-      <w:tr>
-        <w:tc>
-          <w:tcPr>
-            <w:tcW w:w="4606" w:type="dxa"/>
+            <w:r>
+              <w:instrText xml:space="preserve"> = 0 "nvt" "</w:instrText>
+            </w:r>
+            <w:r>
+              <w:instrText>15</w:instrText>
+            </w:r>
+            <w:r>
+              <w:instrText xml:space="preserve">" </w:instrText>
+            </w:r>
+            <w:r>
+              <w:fldChar w:fldCharType="separate"/>
+            </w:r>
+            <w:r>
+              <w:rPr>
+                <w:noProof/>
+              </w:rPr>
+              <w:t>15</w:t>
+            </w:r>
+            <w:r>
+              <w:fldChar w:fldCharType="end"/>
+            </w:r>
+            <w:bookmarkEnd w:id="0"/>
+          </w:p>
+        </w:tc>
+      </w:tr>
+      <w:tr>
+        <w:tc>
+          <w:tcPr>
+            <w:tcW w:w="4522" w:type="dxa"/>
             <w:shd w:val="clear" w:color="auto" w:fill="D9D9D9" w:themeFill="background1" w:themeFillShade="D9"/>
           </w:tcPr>
           <w:p>
@@ -594,28 +692,79 @@
         </w:tc>
         <w:tc>
           <w:tcPr>
-            <w:tcW w:w="4606" w:type="dxa"/>
-            <w:shd w:val="clear" w:color="auto" w:fill="FFFFFF" w:themeFill="background1"/>
-          </w:tcPr>
-          <w:p>
-            <w:pPr>
-              <w:jc w:val="right"/>
-            </w:pPr>
+            <w:tcW w:w="4540" w:type="dxa"/>
+            <w:shd w:val="clear" w:color="auto" w:fill="FFFFFF" w:themeFill="background1"/>
+          </w:tcPr>
+          <w:p>
+            <w:pPr>
+              <w:jc w:val="right"/>
+            </w:pPr>
+            <w:r>
+              <w:fldChar w:fldCharType="begin"/>
+            </w:r>
+            <w:r>
+              <w:instrText xml:space="preserve"> IF </w:instrText>
+            </w:r>
             <w:fldSimple w:instr=" MERGEFIELD fiveVoltAmps ">
               <w:r>
                 <w:rPr>
                   <w:noProof/>
                 </w:rPr>
-                <w:t>3</w:t>
+                <w:instrText>3</w:instrText>
               </w:r>
             </w:fldSimple>
-          </w:p>
-        </w:tc>
-      </w:tr>
-      <w:tr>
-        <w:tc>
-          <w:tcPr>
-            <w:tcW w:w="4606" w:type="dxa"/>
+            <w:r>
+              <w:instrText xml:space="preserve"> = 0 "nvt" </w:instrText>
+            </w:r>
+            <w:r>
+              <w:fldChar w:fldCharType="begin"/>
+            </w:r>
+            <w:r>
+              <w:instrText xml:space="preserve"> MERGEFIELD fiveVolt</w:instrText>
+            </w:r>
+            <w:r>
+              <w:instrText>Amps</w:instrText>
+            </w:r>
+            <w:r>
+              <w:instrText xml:space="preserve"> </w:instrText>
+            </w:r>
+            <w:r>
+              <w:fldChar w:fldCharType="separate"/>
+            </w:r>
+            <w:r>
+              <w:rPr>
+                <w:noProof/>
+              </w:rPr>
+              <w:instrText>3</w:instrText>
+            </w:r>
+            <w:r>
+              <w:rPr>
+                <w:noProof/>
+              </w:rPr>
+              <w:fldChar w:fldCharType="end"/>
+            </w:r>
+            <w:r>
+              <w:instrText xml:space="preserve"> </w:instrText>
+            </w:r>
+            <w:r>
+              <w:fldChar w:fldCharType="separate"/>
+            </w:r>
+            <w:r>
+              <w:rPr>
+                <w:noProof/>
+              </w:rPr>
+              <w:t>3</w:t>
+            </w:r>
+            <w:r>
+              <w:fldChar w:fldCharType="end"/>
+            </w:r>
+          </w:p>
+        </w:tc>
+      </w:tr>
+      <w:tr>
+        <w:tc>
+          <w:tcPr>
+            <w:tcW w:w="4522" w:type="dxa"/>
             <w:shd w:val="clear" w:color="auto" w:fill="D9D9D9" w:themeFill="background1" w:themeFillShade="D9"/>
           </w:tcPr>
           <w:p>
@@ -626,28 +775,86 @@
         </w:tc>
         <w:tc>
           <w:tcPr>
-            <w:tcW w:w="4606" w:type="dxa"/>
-            <w:shd w:val="clear" w:color="auto" w:fill="FFFFFF" w:themeFill="background1"/>
-          </w:tcPr>
-          <w:p>
-            <w:pPr>
-              <w:jc w:val="right"/>
-            </w:pPr>
-            <w:fldSimple w:instr=" MERGEFIELD fiveVoltTurns ">
-              <w:r>
-                <w:rPr>
-                  <w:noProof/>
-                </w:rPr>
-                <w:t>19</w:t>
-              </w:r>
-            </w:fldSimple>
-          </w:p>
-        </w:tc>
-      </w:tr>
-      <w:tr>
-        <w:tc>
-          <w:tcPr>
-            <w:tcW w:w="4606" w:type="dxa"/>
+            <w:tcW w:w="4540" w:type="dxa"/>
+            <w:shd w:val="clear" w:color="auto" w:fill="FFFFFF" w:themeFill="background1"/>
+          </w:tcPr>
+          <w:p>
+            <w:pPr>
+              <w:jc w:val="right"/>
+            </w:pPr>
+            <w:r>
+              <w:fldChar w:fldCharType="begin"/>
+            </w:r>
+            <w:r>
+              <w:instrText xml:space="preserve"> IF </w:instrText>
+            </w:r>
+            <w:r>
+              <w:fldChar w:fldCharType="begin"/>
+            </w:r>
+            <w:r>
+              <w:instrText xml:space="preserve"> MERGEFIELD fiveVoltTurns </w:instrText>
+            </w:r>
+            <w:r>
+              <w:fldChar w:fldCharType="separate"/>
+            </w:r>
+            <w:r>
+              <w:rPr>
+                <w:noProof/>
+              </w:rPr>
+              <w:instrText>19</w:instrText>
+            </w:r>
+            <w:r>
+              <w:rPr>
+                <w:noProof/>
+              </w:rPr>
+              <w:fldChar w:fldCharType="end"/>
+            </w:r>
+            <w:r>
+              <w:instrText xml:space="preserve"> = 0 "nvt" </w:instrText>
+            </w:r>
+            <w:r>
+              <w:fldChar w:fldCharType="begin"/>
+            </w:r>
+            <w:r>
+              <w:instrText xml:space="preserve"> MERGEFIELD fiveVoltTurns </w:instrText>
+            </w:r>
+            <w:r>
+              <w:fldChar w:fldCharType="separate"/>
+            </w:r>
+            <w:r>
+              <w:rPr>
+                <w:noProof/>
+              </w:rPr>
+              <w:instrText>19</w:instrText>
+            </w:r>
+            <w:r>
+              <w:rPr>
+                <w:noProof/>
+              </w:rPr>
+              <w:fldChar w:fldCharType="end"/>
+            </w:r>
+            <w:r>
+              <w:instrText xml:space="preserve"> </w:instrText>
+            </w:r>
+            <w:r>
+              <w:fldChar w:fldCharType="separate"/>
+            </w:r>
+            <w:r>
+              <w:rPr>
+                <w:noProof/>
+              </w:rPr>
+              <w:t>19</w:t>
+            </w:r>
+            <w:r>
+              <w:fldChar w:fldCharType="end"/>
+            </w:r>
+          </w:p>
+        </w:tc>
+      </w:tr>
+      <w:tr>
+        <w:tc>
+          <w:tcPr>
+            <w:tcW w:w="4522" w:type="dxa"/>
             <w:shd w:val="clear" w:color="auto" w:fill="D9D9D9" w:themeFill="background1" w:themeFillShade="D9"/>
           </w:tcPr>
           <w:p>
@@ -658,28 +865,98 @@
         </w:tc>
         <w:tc>
           <w:tcPr>
-            <w:tcW w:w="4606" w:type="dxa"/>
-            <w:shd w:val="clear" w:color="auto" w:fill="FFFFFF" w:themeFill="background1"/>
-          </w:tcPr>
-          <w:p>
-            <w:pPr>
-              <w:jc w:val="right"/>
-            </w:pPr>
-            <w:fldSimple w:instr=" MERGEFIELD fiveVoltWireSize ">
-              <w:r>
-                <w:rPr>
-                  <w:noProof/>
-                </w:rPr>
-                <w:t>0,60</w:t>
-              </w:r>
-            </w:fldSimple>
-          </w:p>
-        </w:tc>
-      </w:tr>
-      <w:tr>
-        <w:tc>
-          <w:tcPr>
-            <w:tcW w:w="4606" w:type="dxa"/>
+            <w:tcW w:w="4540" w:type="dxa"/>
+            <w:shd w:val="clear" w:color="auto" w:fill="FFFFFF" w:themeFill="background1"/>
+          </w:tcPr>
+          <w:p>
+            <w:pPr>
+              <w:jc w:val="right"/>
+            </w:pPr>
+            <w:r>
+              <w:fldChar w:fldCharType="begin"/>
+            </w:r>
+            <w:r>
+              <w:instrText xml:space="preserve"> IF </w:instrText>
+            </w:r>
+            <w:r>
+              <w:fldChar w:fldCharType="begin"/>
+            </w:r>
+            <w:r>
+              <w:instrText xml:space="preserve"> MERGEFIELD fiveVolt</w:instrText>
+            </w:r>
+            <w:r>
+              <w:instrText>WireSize</w:instrText>
+            </w:r>
+            <w:r>
+              <w:instrText xml:space="preserve"> </w:instrText>
+            </w:r>
+            <w:r>
+              <w:fldChar w:fldCharType="separate"/>
+            </w:r>
+            <w:r>
+              <w:rPr>
+                <w:noProof/>
+              </w:rPr>
+              <w:instrText>0,6</w:instrText>
+            </w:r>
+            <w:r>
+              <w:rPr>
+                <w:noProof/>
+              </w:rPr>
+              <w:fldChar w:fldCharType="end"/>
+            </w:r>
+            <w:r>
+              <w:instrText xml:space="preserve"> = 0 "nvt" </w:instrText>
+            </w:r>
+            <w:r>
+              <w:fldChar w:fldCharType="begin"/>
+            </w:r>
+            <w:r>
+              <w:instrText xml:space="preserve"> MERGEFIELD fiveVolt</w:instrText>
+            </w:r>
+            <w:r>
+              <w:instrText>WireSize</w:instrText>
+            </w:r>
+            <w:r>
+              <w:instrText xml:space="preserve"> </w:instrText>
+            </w:r>
+            <w:r>
+              <w:fldChar w:fldCharType="separate"/>
+            </w:r>
+            <w:r>
+              <w:rPr>
+                <w:noProof/>
+              </w:rPr>
+              <w:instrText>0,6</w:instrText>
+            </w:r>
+            <w:r>
+              <w:rPr>
+                <w:noProof/>
+              </w:rPr>
+              <w:fldChar w:fldCharType="end"/>
+            </w:r>
+            <w:r>
+              <w:instrText xml:space="preserve"> </w:instrText>
+            </w:r>
+            <w:r>
+              <w:fldChar w:fldCharType="separate"/>
+            </w:r>
+            <w:r>
+              <w:rPr>
+                <w:noProof/>
+              </w:rPr>
+              <w:t>0,6</w:t>
+            </w:r>
+            <w:r>
+              <w:fldChar w:fldCharType="end"/>
+            </w:r>
+          </w:p>
+        </w:tc>
+      </w:tr>
+      <w:tr>
+        <w:tc>
+          <w:tcPr>
+            <w:tcW w:w="4522" w:type="dxa"/>
             <w:shd w:val="clear" w:color="auto" w:fill="D9D9D9" w:themeFill="background1" w:themeFillShade="D9"/>
           </w:tcPr>
           <w:p>
@@ -690,456 +967,1103 @@
         </w:tc>
         <w:tc>
           <w:tcPr>
-            <w:tcW w:w="4606" w:type="dxa"/>
-            <w:shd w:val="clear" w:color="auto" w:fill="FFFFFF" w:themeFill="background1"/>
-          </w:tcPr>
-          <w:p>
-            <w:pPr>
-              <w:jc w:val="right"/>
-            </w:pPr>
-            <w:fldSimple w:instr=" MERGEFIELD fiveVoltCenterTap ">
-              <w:r>
-                <w:rPr>
-                  <w:noProof/>
-                </w:rPr>
-                <w:t>10</w:t>
-              </w:r>
-            </w:fldSimple>
-          </w:p>
-        </w:tc>
-      </w:tr>
-      <w:tr>
-        <w:tc>
-          <w:tcPr>
-            <w:tcW w:w="4606" w:type="dxa"/>
+            <w:tcW w:w="4540" w:type="dxa"/>
+            <w:shd w:val="clear" w:color="auto" w:fill="FFFFFF" w:themeFill="background1"/>
+          </w:tcPr>
+          <w:p>
+            <w:pPr>
+              <w:jc w:val="right"/>
+            </w:pPr>
+            <w:r>
+              <w:fldChar w:fldCharType="begin"/>
+            </w:r>
+            <w:r>
+              <w:instrText xml:space="preserve"> IF </w:instrText>
+            </w:r>
+            <w:r>
+              <w:fldChar w:fldCharType="begin"/>
+            </w:r>
+            <w:r>
+              <w:instrText xml:space="preserve"> MERGEFIELD fiveVolt</w:instrText>
+            </w:r>
+            <w:r>
+              <w:instrText>CenterTap</w:instrText>
+            </w:r>
+            <w:r>
+              <w:instrText xml:space="preserve"> </w:instrText>
+            </w:r>
+            <w:r>
+              <w:fldChar w:fldCharType="separate"/>
+            </w:r>
+            <w:r>
+              <w:rPr>
+                <w:noProof/>
+              </w:rPr>
+              <w:instrText>10</w:instrText>
+            </w:r>
+            <w:r>
+              <w:rPr>
+                <w:noProof/>
+              </w:rPr>
+              <w:fldChar w:fldCharType="end"/>
+            </w:r>
+            <w:r>
+              <w:instrText xml:space="preserve"> = 0 "nvt" </w:instrText>
+            </w:r>
+            <w:r>
+              <w:fldChar w:fldCharType="begin"/>
+            </w:r>
+            <w:r>
+              <w:instrText xml:space="preserve"> MERGEFIELD fiveVolt</w:instrText>
+            </w:r>
+            <w:r>
+              <w:instrText>CenterTap</w:instrText>
+            </w:r>
+            <w:r>
+              <w:instrText xml:space="preserve"> </w:instrText>
+            </w:r>
+            <w:r>
+              <w:fldChar w:fldCharType="separate"/>
+            </w:r>
+            <w:r>
+              <w:rPr>
+                <w:noProof/>
+              </w:rPr>
+              <w:instrText>10</w:instrText>
+            </w:r>
+            <w:r>
+              <w:rPr>
+                <w:noProof/>
+              </w:rPr>
+              <w:fldChar w:fldCharType="end"/>
+            </w:r>
+            <w:r>
+              <w:instrText xml:space="preserve"> </w:instrText>
+            </w:r>
+            <w:r>
+              <w:fldChar w:fldCharType="separate"/>
+            </w:r>
+            <w:r>
+              <w:rPr>
+                <w:noProof/>
+              </w:rPr>
+              <w:t>10</w:t>
+            </w:r>
+            <w:r>
+              <w:fldChar w:fldCharType="end"/>
+            </w:r>
+          </w:p>
+        </w:tc>
+      </w:tr>
+      <w:tr>
+        <w:tc>
+          <w:tcPr>
+            <w:tcW w:w="4522" w:type="dxa"/>
             <w:shd w:val="clear" w:color="auto" w:fill="D9D9D9" w:themeFill="background1" w:themeFillShade="D9"/>
           </w:tcPr>
           <w:p/>
         </w:tc>
         <w:tc>
           <w:tcPr>
-            <w:tcW w:w="4606" w:type="dxa"/>
-            <w:shd w:val="clear" w:color="auto" w:fill="FFFFFF" w:themeFill="background1"/>
-          </w:tcPr>
-          <w:p>
-            <w:pPr>
-              <w:jc w:val="right"/>
-            </w:pPr>
-          </w:p>
-        </w:tc>
-      </w:tr>
-      <w:tr>
-        <w:tc>
-          <w:tcPr>
-            <w:tcW w:w="4606" w:type="dxa"/>
-            <w:shd w:val="clear" w:color="auto" w:fill="D9D9D9" w:themeFill="background1" w:themeFillShade="D9"/>
-          </w:tcPr>
-          <w:p>
-            <w:r>
-              <w:t xml:space="preserve">Vermogen </w:t>
-            </w:r>
-            <w:r>
-              <w:t>6,3</w:t>
-            </w:r>
-            <w:r>
-              <w:t xml:space="preserve"> volt wikkeling (VA)</w:t>
-            </w:r>
-          </w:p>
-        </w:tc>
-        <w:tc>
-          <w:tcPr>
-            <w:tcW w:w="4606" w:type="dxa"/>
-            <w:shd w:val="clear" w:color="auto" w:fill="FFFFFF" w:themeFill="background1"/>
-          </w:tcPr>
-          <w:p>
-            <w:pPr>
-              <w:jc w:val="right"/>
-            </w:pPr>
-            <w:fldSimple w:instr=" MERGEFIELD sixVoltVA ">
-              <w:r>
-                <w:rPr>
-                  <w:noProof/>
-                </w:rPr>
-                <w:t>12,6</w:t>
-              </w:r>
-            </w:fldSimple>
-          </w:p>
-        </w:tc>
-      </w:tr>
-      <w:tr>
-        <w:tc>
-          <w:tcPr>
-            <w:tcW w:w="4606" w:type="dxa"/>
-            <w:shd w:val="clear" w:color="auto" w:fill="D9D9D9" w:themeFill="background1" w:themeFillShade="D9"/>
-          </w:tcPr>
-          <w:p>
-            <w:r>
-              <w:t xml:space="preserve">Amperage </w:t>
-            </w:r>
-            <w:r>
-              <w:t>6,3</w:t>
-            </w:r>
-            <w:r>
-              <w:t xml:space="preserve"> volt wikkeling (A)</w:t>
-            </w:r>
-          </w:p>
-        </w:tc>
-        <w:tc>
-          <w:tcPr>
-            <w:tcW w:w="4606" w:type="dxa"/>
-            <w:shd w:val="clear" w:color="auto" w:fill="FFFFFF" w:themeFill="background1"/>
-          </w:tcPr>
-          <w:p>
-            <w:pPr>
-              <w:jc w:val="right"/>
-            </w:pPr>
-            <w:fldSimple w:instr=" MERGEFIELD sixVoltAmps ">
-              <w:r>
-                <w:rPr>
-                  <w:noProof/>
-                </w:rPr>
-                <w:t>2</w:t>
-              </w:r>
-            </w:fldSimple>
-          </w:p>
-        </w:tc>
-      </w:tr>
-      <w:tr>
-        <w:tc>
-          <w:tcPr>
-            <w:tcW w:w="4606" w:type="dxa"/>
-            <w:shd w:val="clear" w:color="auto" w:fill="D9D9D9" w:themeFill="background1" w:themeFillShade="D9"/>
-          </w:tcPr>
-          <w:p>
-            <w:r>
-              <w:t xml:space="preserve">Aantal </w:t>
-            </w:r>
-            <w:r>
-              <w:t>6,3</w:t>
-            </w:r>
-            <w:r>
-              <w:t xml:space="preserve"> volt wikkelingen </w:t>
-            </w:r>
-          </w:p>
-        </w:tc>
-        <w:tc>
-          <w:tcPr>
-            <w:tcW w:w="4606" w:type="dxa"/>
-            <w:shd w:val="clear" w:color="auto" w:fill="FFFFFF" w:themeFill="background1"/>
-          </w:tcPr>
-          <w:p>
-            <w:pPr>
-              <w:jc w:val="right"/>
-            </w:pPr>
-            <w:fldSimple w:instr=" MERGEFIELD sixVoltTurns ">
-              <w:r>
-                <w:rPr>
-                  <w:noProof/>
-                </w:rPr>
-                <w:t>24</w:t>
-              </w:r>
-            </w:fldSimple>
-          </w:p>
-        </w:tc>
-      </w:tr>
-      <w:tr>
-        <w:tc>
-          <w:tcPr>
-            <w:tcW w:w="4606" w:type="dxa"/>
-            <w:shd w:val="clear" w:color="auto" w:fill="D9D9D9" w:themeFill="background1" w:themeFillShade="D9"/>
-          </w:tcPr>
-          <w:p>
-            <w:r>
-              <w:t>6,3</w:t>
-            </w:r>
-            <w:r>
-              <w:t xml:space="preserve"> volt draaddiameter</w:t>
-            </w:r>
-          </w:p>
-        </w:tc>
-        <w:tc>
-          <w:tcPr>
-            <w:tcW w:w="4606" w:type="dxa"/>
-            <w:shd w:val="clear" w:color="auto" w:fill="FFFFFF" w:themeFill="background1"/>
-          </w:tcPr>
-          <w:p>
-            <w:pPr>
-              <w:jc w:val="right"/>
-            </w:pPr>
-            <w:fldSimple w:instr=" MERGEFIELD sixVoltWireSize ">
-              <w:r>
-                <w:rPr>
-                  <w:noProof/>
-                </w:rPr>
-                <w:t>0,50</w:t>
-              </w:r>
-            </w:fldSimple>
-          </w:p>
-        </w:tc>
-      </w:tr>
-      <w:tr>
-        <w:tc>
-          <w:tcPr>
-            <w:tcW w:w="4606" w:type="dxa"/>
-            <w:shd w:val="clear" w:color="auto" w:fill="D9D9D9" w:themeFill="background1" w:themeFillShade="D9"/>
-          </w:tcPr>
-          <w:p>
-            <w:r>
-              <w:t>6,3</w:t>
-            </w:r>
-            <w:r>
-              <w:t xml:space="preserve"> volt middenaftakking op wikkeling</w:t>
-            </w:r>
-          </w:p>
-        </w:tc>
-        <w:tc>
-          <w:tcPr>
-            <w:tcW w:w="4606" w:type="dxa"/>
-            <w:shd w:val="clear" w:color="auto" w:fill="FFFFFF" w:themeFill="background1"/>
-          </w:tcPr>
-          <w:p>
-            <w:pPr>
-              <w:jc w:val="right"/>
-            </w:pPr>
-            <w:fldSimple w:instr=" MERGEFIELD sixVoltCenterTap ">
-              <w:r>
-                <w:rPr>
-                  <w:noProof/>
-                </w:rPr>
-                <w:t>12</w:t>
-              </w:r>
-            </w:fldSimple>
-          </w:p>
-        </w:tc>
-      </w:tr>
-      <w:tr>
-        <w:tc>
-          <w:tcPr>
-            <w:tcW w:w="4606" w:type="dxa"/>
+            <w:tcW w:w="4540" w:type="dxa"/>
+            <w:shd w:val="clear" w:color="auto" w:fill="FFFFFF" w:themeFill="background1"/>
+          </w:tcPr>
+          <w:p>
+            <w:pPr>
+              <w:jc w:val="right"/>
+            </w:pPr>
+          </w:p>
+        </w:tc>
+      </w:tr>
+      <w:tr>
+        <w:tc>
+          <w:tcPr>
+            <w:tcW w:w="4522" w:type="dxa"/>
+            <w:shd w:val="clear" w:color="auto" w:fill="D9D9D9" w:themeFill="background1" w:themeFillShade="D9"/>
+          </w:tcPr>
+          <w:p>
+            <w:r>
+              <w:t>Vermogen 6,3 volt wikkeling (VA)</w:t>
+            </w:r>
+          </w:p>
+        </w:tc>
+        <w:tc>
+          <w:tcPr>
+            <w:tcW w:w="4540" w:type="dxa"/>
+            <w:shd w:val="clear" w:color="auto" w:fill="FFFFFF" w:themeFill="background1"/>
+          </w:tcPr>
+          <w:p>
+            <w:pPr>
+              <w:jc w:val="right"/>
+            </w:pPr>
+            <w:r>
+              <w:fldChar w:fldCharType="begin"/>
+            </w:r>
+            <w:r>
+              <w:instrText xml:space="preserve"> IF </w:instrText>
+            </w:r>
+            <w:r>
+              <w:fldChar w:fldCharType="begin"/>
+            </w:r>
+            <w:r>
+              <w:instrText xml:space="preserve"> MERGEFIELD </w:instrText>
+            </w:r>
+            <w:r>
+              <w:instrText>six</w:instrText>
+            </w:r>
+            <w:r>
+              <w:instrText xml:space="preserve">VoltVA </w:instrText>
+            </w:r>
+            <w:r>
+              <w:fldChar w:fldCharType="separate"/>
+            </w:r>
+            <w:r>
+              <w:rPr>
+                <w:noProof/>
+              </w:rPr>
+              <w:instrText>12,6</w:instrText>
+            </w:r>
+            <w:r>
+              <w:fldChar w:fldCharType="end"/>
+            </w:r>
+            <w:r>
+              <w:instrText xml:space="preserve"> = 0 "nvt" </w:instrText>
+            </w:r>
+            <w:r>
+              <w:fldChar w:fldCharType="begin"/>
+            </w:r>
+            <w:r>
+              <w:instrText xml:space="preserve"> MERGEFIELD sixVoltVA </w:instrText>
+            </w:r>
+            <w:r>
+              <w:fldChar w:fldCharType="separate"/>
+            </w:r>
+            <w:r>
+              <w:rPr>
+                <w:noProof/>
+              </w:rPr>
+              <w:instrText>12,6</w:instrText>
+            </w:r>
+            <w:r>
+              <w:fldChar w:fldCharType="end"/>
+            </w:r>
+            <w:r>
+              <w:instrText xml:space="preserve"> </w:instrText>
+            </w:r>
+            <w:r>
+              <w:fldChar w:fldCharType="separate"/>
+            </w:r>
+            <w:r>
+              <w:rPr>
+                <w:noProof/>
+              </w:rPr>
+              <w:t>12,6</w:t>
+            </w:r>
+            <w:r>
+              <w:fldChar w:fldCharType="end"/>
+            </w:r>
+          </w:p>
+        </w:tc>
+      </w:tr>
+      <w:tr>
+        <w:tc>
+          <w:tcPr>
+            <w:tcW w:w="4522" w:type="dxa"/>
+            <w:shd w:val="clear" w:color="auto" w:fill="D9D9D9" w:themeFill="background1" w:themeFillShade="D9"/>
+          </w:tcPr>
+          <w:p>
+            <w:r>
+              <w:t>Amperage 6,3 volt wikkeling (A)</w:t>
+            </w:r>
+          </w:p>
+        </w:tc>
+        <w:tc>
+          <w:tcPr>
+            <w:tcW w:w="4540" w:type="dxa"/>
+            <w:shd w:val="clear" w:color="auto" w:fill="FFFFFF" w:themeFill="background1"/>
+          </w:tcPr>
+          <w:p>
+            <w:pPr>
+              <w:jc w:val="right"/>
+            </w:pPr>
+            <w:r>
+              <w:fldChar w:fldCharType="begin"/>
+            </w:r>
+            <w:r>
+              <w:instrText xml:space="preserve"> IF </w:instrText>
+            </w:r>
+            <w:r>
+              <w:fldChar w:fldCharType="begin"/>
+            </w:r>
+            <w:r>
+              <w:instrText xml:space="preserve"> MERGEFIELD </w:instrText>
+            </w:r>
+            <w:r>
+              <w:instrText>six</w:instrText>
+            </w:r>
+            <w:r>
+              <w:instrText xml:space="preserve">VoltAmps </w:instrText>
+            </w:r>
+            <w:r>
+              <w:fldChar w:fldCharType="separate"/>
+            </w:r>
+            <w:r>
+              <w:rPr>
+                <w:noProof/>
+              </w:rPr>
+              <w:instrText>2</w:instrText>
+            </w:r>
+            <w:r>
+              <w:fldChar w:fldCharType="end"/>
+            </w:r>
+            <w:r>
+              <w:instrText xml:space="preserve"> = 0 "nvt" </w:instrText>
+            </w:r>
+            <w:r>
+              <w:fldChar w:fldCharType="begin"/>
+            </w:r>
+            <w:r>
+              <w:instrText xml:space="preserve"> MERGEFIELD </w:instrText>
+            </w:r>
+            <w:r>
+              <w:instrText>six</w:instrText>
+            </w:r>
+            <w:r>
+              <w:instrText xml:space="preserve">VoltAmps </w:instrText>
+            </w:r>
+            <w:r>
+              <w:fldChar w:fldCharType="separate"/>
+            </w:r>
+            <w:r>
+              <w:rPr>
+                <w:noProof/>
+              </w:rPr>
+              <w:instrText>2</w:instrText>
+            </w:r>
+            <w:r>
+              <w:rPr>
+                <w:noProof/>
+              </w:rPr>
+              <w:fldChar w:fldCharType="end"/>
+            </w:r>
+            <w:r>
+              <w:instrText xml:space="preserve"> </w:instrText>
+            </w:r>
+            <w:r>
+              <w:fldChar w:fldCharType="separate"/>
+            </w:r>
+            <w:r>
+              <w:rPr>
+                <w:noProof/>
+              </w:rPr>
+              <w:t>2</w:t>
+            </w:r>
+            <w:r>
+              <w:fldChar w:fldCharType="end"/>
+            </w:r>
+          </w:p>
+        </w:tc>
+      </w:tr>
+      <w:tr>
+        <w:tc>
+          <w:tcPr>
+            <w:tcW w:w="4522" w:type="dxa"/>
+            <w:shd w:val="clear" w:color="auto" w:fill="D9D9D9" w:themeFill="background1" w:themeFillShade="D9"/>
+          </w:tcPr>
+          <w:p>
+            <w:r>
+              <w:t xml:space="preserve">Aantal 6,3 volt wikkelingen </w:t>
+            </w:r>
+          </w:p>
+        </w:tc>
+        <w:tc>
+          <w:tcPr>
+            <w:tcW w:w="4540" w:type="dxa"/>
+            <w:shd w:val="clear" w:color="auto" w:fill="FFFFFF" w:themeFill="background1"/>
+          </w:tcPr>
+          <w:p>
+            <w:pPr>
+              <w:jc w:val="right"/>
+            </w:pPr>
+            <w:r>
+              <w:fldChar w:fldCharType="begin"/>
+            </w:r>
+            <w:r>
+              <w:instrText xml:space="preserve"> IF </w:instrText>
+            </w:r>
+            <w:r>
+              <w:fldChar w:fldCharType="begin"/>
+            </w:r>
+            <w:r>
+              <w:instrText xml:space="preserve"> MERGEFIELD </w:instrText>
+            </w:r>
+            <w:r>
+              <w:instrText>six</w:instrText>
+            </w:r>
+            <w:r>
+              <w:instrText xml:space="preserve">VoltTurns </w:instrText>
+            </w:r>
+            <w:r>
+              <w:fldChar w:fldCharType="separate"/>
+            </w:r>
+            <w:r>
+              <w:rPr>
+                <w:noProof/>
+              </w:rPr>
+              <w:instrText>24</w:instrText>
+            </w:r>
+            <w:r>
+              <w:rPr>
+                <w:noProof/>
+              </w:rPr>
+              <w:fldChar w:fldCharType="end"/>
+            </w:r>
+            <w:r>
+              <w:instrText xml:space="preserve"> = 0 "nvt" </w:instrText>
+            </w:r>
+            <w:r>
+              <w:fldChar w:fldCharType="begin"/>
+            </w:r>
+            <w:r>
+              <w:instrText xml:space="preserve"> MERGEFIELD sixVoltTurns </w:instrText>
+            </w:r>
+            <w:r>
+              <w:fldChar w:fldCharType="separate"/>
+            </w:r>
+            <w:r>
+              <w:rPr>
+                <w:noProof/>
+              </w:rPr>
+              <w:instrText>24</w:instrText>
+            </w:r>
+            <w:r>
+              <w:rPr>
+                <w:noProof/>
+              </w:rPr>
+              <w:fldChar w:fldCharType="end"/>
+            </w:r>
+            <w:r>
+              <w:instrText xml:space="preserve"> </w:instrText>
+            </w:r>
+            <w:r>
+              <w:fldChar w:fldCharType="separate"/>
+            </w:r>
+            <w:r>
+              <w:rPr>
+                <w:noProof/>
+              </w:rPr>
+              <w:t>24</w:t>
+            </w:r>
+            <w:r>
+              <w:fldChar w:fldCharType="end"/>
+            </w:r>
+          </w:p>
+        </w:tc>
+      </w:tr>
+      <w:tr>
+        <w:tc>
+          <w:tcPr>
+            <w:tcW w:w="4522" w:type="dxa"/>
+            <w:shd w:val="clear" w:color="auto" w:fill="D9D9D9" w:themeFill="background1" w:themeFillShade="D9"/>
+          </w:tcPr>
+          <w:p>
+            <w:r>
+              <w:t>6,3 volt draaddiameter</w:t>
+            </w:r>
+          </w:p>
+        </w:tc>
+        <w:tc>
+          <w:tcPr>
+            <w:tcW w:w="4540" w:type="dxa"/>
+            <w:shd w:val="clear" w:color="auto" w:fill="FFFFFF" w:themeFill="background1"/>
+          </w:tcPr>
+          <w:p>
+            <w:pPr>
+              <w:jc w:val="right"/>
+            </w:pPr>
+            <w:r>
+              <w:fldChar w:fldCharType="begin"/>
+            </w:r>
+            <w:r>
+              <w:instrText xml:space="preserve"> IF </w:instrText>
+            </w:r>
+            <w:r>
+              <w:fldChar w:fldCharType="begin"/>
+            </w:r>
+            <w:r>
+              <w:instrText xml:space="preserve"> MERGEFIELD </w:instrText>
+            </w:r>
+            <w:r>
+              <w:instrText>six</w:instrText>
+            </w:r>
+            <w:r>
+              <w:instrText xml:space="preserve">VoltWireSize </w:instrText>
+            </w:r>
+            <w:r>
+              <w:fldChar w:fldCharType="separate"/>
+            </w:r>
+            <w:r>
+              <w:rPr>
+                <w:noProof/>
+              </w:rPr>
+              <w:instrText>0,5</w:instrText>
+            </w:r>
+            <w:r>
+              <w:rPr>
+                <w:noProof/>
+              </w:rPr>
+              <w:fldChar w:fldCharType="end"/>
+            </w:r>
+            <w:r>
+              <w:instrText xml:space="preserve"> = 0 "nvt" </w:instrText>
+            </w:r>
+            <w:r>
+              <w:fldChar w:fldCharType="begin"/>
+            </w:r>
+            <w:r>
+              <w:instrText xml:space="preserve"> MERGEFIELD sixVoltWireSize </w:instrText>
+            </w:r>
+            <w:r>
+              <w:fldChar w:fldCharType="separate"/>
+            </w:r>
+            <w:r>
+              <w:rPr>
+                <w:noProof/>
+              </w:rPr>
+              <w:instrText>0,5</w:instrText>
+            </w:r>
+            <w:r>
+              <w:rPr>
+                <w:noProof/>
+              </w:rPr>
+              <w:fldChar w:fldCharType="end"/>
+            </w:r>
+            <w:r>
+              <w:instrText xml:space="preserve"> </w:instrText>
+            </w:r>
+            <w:r>
+              <w:fldChar w:fldCharType="separate"/>
+            </w:r>
+            <w:r>
+              <w:rPr>
+                <w:noProof/>
+              </w:rPr>
+              <w:t>0,5</w:t>
+            </w:r>
+            <w:r>
+              <w:fldChar w:fldCharType="end"/>
+            </w:r>
+          </w:p>
+        </w:tc>
+      </w:tr>
+      <w:tr>
+        <w:tc>
+          <w:tcPr>
+            <w:tcW w:w="4522" w:type="dxa"/>
+            <w:shd w:val="clear" w:color="auto" w:fill="D9D9D9" w:themeFill="background1" w:themeFillShade="D9"/>
+          </w:tcPr>
+          <w:p>
+            <w:r>
+              <w:t>6,3 volt middenaftakking op wikkeling</w:t>
+            </w:r>
+          </w:p>
+        </w:tc>
+        <w:tc>
+          <w:tcPr>
+            <w:tcW w:w="4540" w:type="dxa"/>
+            <w:shd w:val="clear" w:color="auto" w:fill="FFFFFF" w:themeFill="background1"/>
+          </w:tcPr>
+          <w:p>
+            <w:pPr>
+              <w:jc w:val="right"/>
+            </w:pPr>
+            <w:r>
+              <w:fldChar w:fldCharType="begin"/>
+            </w:r>
+            <w:r>
+              <w:instrText xml:space="preserve"> IF </w:instrText>
+            </w:r>
+            <w:r>
+              <w:fldChar w:fldCharType="begin"/>
+            </w:r>
+            <w:r>
+              <w:instrText xml:space="preserve"> MERGEFIELD </w:instrText>
+            </w:r>
+            <w:r>
+              <w:instrText>six</w:instrText>
+            </w:r>
+            <w:r>
+              <w:instrText xml:space="preserve">VoltCenterTap </w:instrText>
+            </w:r>
+            <w:r>
+              <w:fldChar w:fldCharType="separate"/>
+            </w:r>
+            <w:r>
+              <w:rPr>
+                <w:noProof/>
+              </w:rPr>
+              <w:instrText>12</w:instrText>
+            </w:r>
+            <w:r>
+              <w:rPr>
+                <w:noProof/>
+              </w:rPr>
+              <w:fldChar w:fldCharType="end"/>
+            </w:r>
+            <w:r>
+              <w:instrText xml:space="preserve"> = 0 "nvt" </w:instrText>
+            </w:r>
+            <w:r>
+              <w:fldChar w:fldCharType="begin"/>
+            </w:r>
+            <w:r>
+              <w:instrText xml:space="preserve"> MERGEFIELD sixVoltCenterTap </w:instrText>
+            </w:r>
+            <w:r>
+              <w:fldChar w:fldCharType="separate"/>
+            </w:r>
+            <w:r>
+              <w:rPr>
+                <w:noProof/>
+              </w:rPr>
+              <w:instrText>12</w:instrText>
+            </w:r>
+            <w:r>
+              <w:rPr>
+                <w:noProof/>
+              </w:rPr>
+              <w:fldChar w:fldCharType="end"/>
+            </w:r>
+            <w:r>
+              <w:instrText xml:space="preserve"> </w:instrText>
+            </w:r>
+            <w:r>
+              <w:fldChar w:fldCharType="separate"/>
+            </w:r>
+            <w:r>
+              <w:rPr>
+                <w:noProof/>
+              </w:rPr>
+              <w:t>12</w:t>
+            </w:r>
+            <w:r>
+              <w:fldChar w:fldCharType="end"/>
+            </w:r>
+          </w:p>
+        </w:tc>
+      </w:tr>
+      <w:tr>
+        <w:tc>
+          <w:tcPr>
+            <w:tcW w:w="4522" w:type="dxa"/>
             <w:shd w:val="clear" w:color="auto" w:fill="D9D9D9" w:themeFill="background1" w:themeFillShade="D9"/>
           </w:tcPr>
           <w:p/>
         </w:tc>
         <w:tc>
           <w:tcPr>
-            <w:tcW w:w="4606" w:type="dxa"/>
-            <w:shd w:val="clear" w:color="auto" w:fill="FFFFFF" w:themeFill="background1"/>
-          </w:tcPr>
-          <w:p>
-            <w:pPr>
-              <w:jc w:val="right"/>
-            </w:pPr>
-          </w:p>
-        </w:tc>
-      </w:tr>
-      <w:tr>
-        <w:tc>
-          <w:tcPr>
-            <w:tcW w:w="4606" w:type="dxa"/>
-            <w:shd w:val="clear" w:color="auto" w:fill="D9D9D9" w:themeFill="background1" w:themeFillShade="D9"/>
-          </w:tcPr>
-          <w:p>
-            <w:r>
-              <w:t xml:space="preserve">Vermogen </w:t>
-            </w:r>
-            <w:r>
-              <w:t>12,6</w:t>
-            </w:r>
-            <w:r>
-              <w:t xml:space="preserve"> volt wikkeling (VA)</w:t>
-            </w:r>
-          </w:p>
-        </w:tc>
-        <w:tc>
-          <w:tcPr>
-            <w:tcW w:w="4606" w:type="dxa"/>
-            <w:shd w:val="clear" w:color="auto" w:fill="FFFFFF" w:themeFill="background1"/>
-          </w:tcPr>
-          <w:p>
-            <w:pPr>
-              <w:jc w:val="right"/>
-            </w:pPr>
-            <w:fldSimple w:instr=" MERGEFIELD twelveVoltVA ">
-              <w:r>
-                <w:rPr>
-                  <w:noProof/>
-                </w:rPr>
-                <w:t>0</w:t>
-              </w:r>
-            </w:fldSimple>
-          </w:p>
-        </w:tc>
-      </w:tr>
-      <w:tr>
-        <w:tc>
-          <w:tcPr>
-            <w:tcW w:w="4606" w:type="dxa"/>
-            <w:shd w:val="clear" w:color="auto" w:fill="D9D9D9" w:themeFill="background1" w:themeFillShade="D9"/>
-          </w:tcPr>
-          <w:p>
-            <w:r>
-              <w:t xml:space="preserve">Amperage </w:t>
-            </w:r>
-            <w:r>
-              <w:t>12,6</w:t>
-            </w:r>
-            <w:r>
-              <w:t xml:space="preserve"> volt wikkeling (A)</w:t>
-            </w:r>
-          </w:p>
-        </w:tc>
-        <w:tc>
-          <w:tcPr>
-            <w:tcW w:w="4606" w:type="dxa"/>
-            <w:shd w:val="clear" w:color="auto" w:fill="FFFFFF" w:themeFill="background1"/>
-          </w:tcPr>
-          <w:p>
-            <w:pPr>
-              <w:jc w:val="right"/>
-            </w:pPr>
-            <w:fldSimple w:instr=" MERGEFIELD twelveVoltAmps ">
-              <w:r>
-                <w:rPr>
-                  <w:noProof/>
-                </w:rPr>
-                <w:t>0</w:t>
-              </w:r>
-            </w:fldSimple>
-          </w:p>
-        </w:tc>
-      </w:tr>
-      <w:tr>
-        <w:tc>
-          <w:tcPr>
-            <w:tcW w:w="4606" w:type="dxa"/>
-            <w:shd w:val="clear" w:color="auto" w:fill="D9D9D9" w:themeFill="background1" w:themeFillShade="D9"/>
-          </w:tcPr>
-          <w:p>
-            <w:r>
-              <w:t xml:space="preserve">Aantal </w:t>
-            </w:r>
-            <w:r>
-              <w:t>12,6</w:t>
-            </w:r>
-            <w:r>
-              <w:t xml:space="preserve"> volt wikkelingen </w:t>
-            </w:r>
-          </w:p>
-        </w:tc>
-        <w:tc>
-          <w:tcPr>
-            <w:tcW w:w="4606" w:type="dxa"/>
-            <w:shd w:val="clear" w:color="auto" w:fill="FFFFFF" w:themeFill="background1"/>
-          </w:tcPr>
-          <w:p>
-            <w:pPr>
-              <w:jc w:val="right"/>
-            </w:pPr>
-            <w:fldSimple w:instr=" MERGEFIELD twelveVoltTurns ">
-              <w:r>
-                <w:rPr>
-                  <w:noProof/>
-                </w:rPr>
-                <w:t>0</w:t>
-              </w:r>
-            </w:fldSimple>
-          </w:p>
-        </w:tc>
-      </w:tr>
-      <w:tr>
-        <w:tc>
-          <w:tcPr>
-            <w:tcW w:w="4606" w:type="dxa"/>
-            <w:shd w:val="clear" w:color="auto" w:fill="D9D9D9" w:themeFill="background1" w:themeFillShade="D9"/>
-          </w:tcPr>
-          <w:p>
-            <w:r>
-              <w:t>12,6</w:t>
-            </w:r>
-            <w:r>
-              <w:t xml:space="preserve"> volt draaddiameter</w:t>
-            </w:r>
-          </w:p>
-        </w:tc>
-        <w:tc>
-          <w:tcPr>
-            <w:tcW w:w="4606" w:type="dxa"/>
-            <w:shd w:val="clear" w:color="auto" w:fill="FFFFFF" w:themeFill="background1"/>
-          </w:tcPr>
-          <w:p>
-            <w:pPr>
-              <w:jc w:val="right"/>
-            </w:pPr>
-            <w:fldSimple w:instr=" MERGEFIELD twelveVoltWireSize ">
-              <w:r>
-                <w:rPr>
-                  <w:noProof/>
-                </w:rPr>
-                <w:t>0,00</w:t>
-              </w:r>
-            </w:fldSimple>
-          </w:p>
-        </w:tc>
-      </w:tr>
-      <w:tr>
-        <w:tc>
-          <w:tcPr>
-            <w:tcW w:w="4606" w:type="dxa"/>
-            <w:shd w:val="clear" w:color="auto" w:fill="D9D9D9" w:themeFill="background1" w:themeFillShade="D9"/>
-          </w:tcPr>
-          <w:p>
-            <w:r>
-              <w:t>12,6</w:t>
-            </w:r>
-            <w:r>
-              <w:t xml:space="preserve"> volt middenaftakking op wikkeling</w:t>
-            </w:r>
-          </w:p>
-        </w:tc>
-        <w:tc>
-          <w:tcPr>
-            <w:tcW w:w="4606" w:type="dxa"/>
-            <w:shd w:val="clear" w:color="auto" w:fill="FFFFFF" w:themeFill="background1"/>
-          </w:tcPr>
-          <w:p>
-            <w:pPr>
-              <w:jc w:val="right"/>
-            </w:pPr>
-            <w:fldSimple w:instr=" MERGEFIELD twelveVoltCenterTap ">
-              <w:r>
-                <w:rPr>
-                  <w:noProof/>
-                </w:rPr>
-                <w:t>0</w:t>
-              </w:r>
-            </w:fldSimple>
-          </w:p>
-        </w:tc>
-      </w:tr>
-      <w:tr>
-        <w:tc>
-          <w:tcPr>
-            <w:tcW w:w="4606" w:type="dxa"/>
+            <w:tcW w:w="4540" w:type="dxa"/>
+            <w:shd w:val="clear" w:color="auto" w:fill="FFFFFF" w:themeFill="background1"/>
+          </w:tcPr>
+          <w:p>
+            <w:pPr>
+              <w:jc w:val="right"/>
+            </w:pPr>
+          </w:p>
+        </w:tc>
+      </w:tr>
+      <w:tr>
+        <w:tc>
+          <w:tcPr>
+            <w:tcW w:w="4522" w:type="dxa"/>
+            <w:shd w:val="clear" w:color="auto" w:fill="D9D9D9" w:themeFill="background1" w:themeFillShade="D9"/>
+          </w:tcPr>
+          <w:p>
+            <w:r>
+              <w:t>Vermogen 12,6 volt wikkeling (VA)</w:t>
+            </w:r>
+          </w:p>
+        </w:tc>
+        <w:tc>
+          <w:tcPr>
+            <w:tcW w:w="4540" w:type="dxa"/>
+            <w:shd w:val="clear" w:color="auto" w:fill="FFFFFF" w:themeFill="background1"/>
+          </w:tcPr>
+          <w:p>
+            <w:pPr>
+              <w:jc w:val="right"/>
+            </w:pPr>
+            <w:r>
+              <w:fldChar w:fldCharType="begin"/>
+            </w:r>
+            <w:r>
+              <w:instrText xml:space="preserve"> IF </w:instrText>
+            </w:r>
+            <w:r>
+              <w:fldChar w:fldCharType="begin"/>
+            </w:r>
+            <w:r>
+              <w:instrText xml:space="preserve"> MERGEFIELD </w:instrText>
+            </w:r>
+            <w:r>
+              <w:instrText>twelve</w:instrText>
+            </w:r>
+            <w:r>
+              <w:instrText xml:space="preserve">VoltVA </w:instrText>
+            </w:r>
+            <w:r>
+              <w:fldChar w:fldCharType="separate"/>
+            </w:r>
+            <w:r>
+              <w:rPr>
+                <w:noProof/>
+              </w:rPr>
+              <w:instrText>0</w:instrText>
+            </w:r>
+            <w:r>
+              <w:fldChar w:fldCharType="end"/>
+            </w:r>
+            <w:r>
+              <w:instrText xml:space="preserve"> = 0 "nvt" </w:instrText>
+            </w:r>
+            <w:r>
+              <w:fldChar w:fldCharType="begin"/>
+            </w:r>
+            <w:r>
+              <w:instrText xml:space="preserve"> MERGEFIELD twelveVoltVA </w:instrText>
+            </w:r>
+            <w:r>
+              <w:fldChar w:fldCharType="separate"/>
+            </w:r>
+            <w:r>
+              <w:rPr>
+                <w:noProof/>
+              </w:rPr>
+              <w:instrText>12,6</w:instrText>
+            </w:r>
+            <w:r>
+              <w:fldChar w:fldCharType="end"/>
+            </w:r>
+            <w:r>
+              <w:instrText xml:space="preserve"> </w:instrText>
+            </w:r>
+            <w:r>
+              <w:fldChar w:fldCharType="separate"/>
+            </w:r>
+            <w:r>
+              <w:rPr>
+                <w:noProof/>
+              </w:rPr>
+              <w:t>nvt</w:t>
+            </w:r>
+            <w:r>
+              <w:fldChar w:fldCharType="end"/>
+            </w:r>
+          </w:p>
+        </w:tc>
+      </w:tr>
+      <w:tr>
+        <w:tc>
+          <w:tcPr>
+            <w:tcW w:w="4522" w:type="dxa"/>
+            <w:shd w:val="clear" w:color="auto" w:fill="D9D9D9" w:themeFill="background1" w:themeFillShade="D9"/>
+          </w:tcPr>
+          <w:p>
+            <w:r>
+              <w:t>Amperage 12,6 volt wikkeling (A)</w:t>
+            </w:r>
+          </w:p>
+        </w:tc>
+        <w:tc>
+          <w:tcPr>
+            <w:tcW w:w="4540" w:type="dxa"/>
+            <w:shd w:val="clear" w:color="auto" w:fill="FFFFFF" w:themeFill="background1"/>
+          </w:tcPr>
+          <w:p>
+            <w:pPr>
+              <w:jc w:val="right"/>
+            </w:pPr>
+            <w:r>
+              <w:fldChar w:fldCharType="begin"/>
+            </w:r>
+            <w:r>
+              <w:instrText xml:space="preserve"> IF </w:instrText>
+            </w:r>
+            <w:r>
+              <w:fldChar w:fldCharType="begin"/>
+            </w:r>
+            <w:r>
+              <w:instrText xml:space="preserve"> MERGEFIELD </w:instrText>
+            </w:r>
+            <w:r>
+              <w:instrText>twelve</w:instrText>
+            </w:r>
+            <w:r>
+              <w:instrText xml:space="preserve">VoltAmps </w:instrText>
+            </w:r>
+            <w:r>
+              <w:fldChar w:fldCharType="separate"/>
+            </w:r>
+            <w:r>
+              <w:rPr>
+                <w:noProof/>
+              </w:rPr>
+              <w:instrText>0</w:instrText>
+            </w:r>
+            <w:r>
+              <w:fldChar w:fldCharType="end"/>
+            </w:r>
+            <w:r>
+              <w:instrText xml:space="preserve"> = 0 "nvt" </w:instrText>
+            </w:r>
+            <w:r>
+              <w:fldChar w:fldCharType="begin"/>
+            </w:r>
+            <w:r>
+              <w:instrText xml:space="preserve"> MERGEFIELD twelveVoltAmps </w:instrText>
+            </w:r>
+            <w:r>
+              <w:fldChar w:fldCharType="separate"/>
+            </w:r>
+            <w:r>
+              <w:rPr>
+                <w:noProof/>
+              </w:rPr>
+              <w:instrText>2</w:instrText>
+            </w:r>
+            <w:r>
+              <w:fldChar w:fldCharType="end"/>
+            </w:r>
+            <w:r>
+              <w:instrText xml:space="preserve"> </w:instrText>
+            </w:r>
+            <w:r>
+              <w:fldChar w:fldCharType="separate"/>
+            </w:r>
+            <w:r>
+              <w:rPr>
+                <w:noProof/>
+              </w:rPr>
+              <w:t>nvt</w:t>
+            </w:r>
+            <w:r>
+              <w:fldChar w:fldCharType="end"/>
+            </w:r>
+          </w:p>
+        </w:tc>
+      </w:tr>
+      <w:tr>
+        <w:tc>
+          <w:tcPr>
+            <w:tcW w:w="4522" w:type="dxa"/>
+            <w:shd w:val="clear" w:color="auto" w:fill="D9D9D9" w:themeFill="background1" w:themeFillShade="D9"/>
+          </w:tcPr>
+          <w:p>
+            <w:r>
+              <w:t xml:space="preserve">Aantal 12,6 volt wikkelingen </w:t>
+            </w:r>
+          </w:p>
+        </w:tc>
+        <w:tc>
+          <w:tcPr>
+            <w:tcW w:w="4540" w:type="dxa"/>
+            <w:shd w:val="clear" w:color="auto" w:fill="FFFFFF" w:themeFill="background1"/>
+          </w:tcPr>
+          <w:p>
+            <w:pPr>
+              <w:jc w:val="right"/>
+            </w:pPr>
+            <w:r>
+              <w:fldChar w:fldCharType="begin"/>
+            </w:r>
+            <w:r>
+              <w:instrText xml:space="preserve"> IF </w:instrText>
+            </w:r>
+            <w:r>
+              <w:fldChar w:fldCharType="begin"/>
+            </w:r>
+            <w:r>
+              <w:instrText xml:space="preserve"> MERGEFIELD </w:instrText>
+            </w:r>
+            <w:r>
+              <w:instrText>twelve</w:instrText>
+            </w:r>
+            <w:r>
+              <w:instrText xml:space="preserve">VoltTurns </w:instrText>
+            </w:r>
+            <w:r>
+              <w:fldChar w:fldCharType="separate"/>
+            </w:r>
+            <w:r>
+              <w:rPr>
+                <w:noProof/>
+              </w:rPr>
+              <w:instrText>0</w:instrText>
+            </w:r>
+            <w:r>
+              <w:rPr>
+                <w:noProof/>
+              </w:rPr>
+              <w:fldChar w:fldCharType="end"/>
+            </w:r>
+            <w:r>
+              <w:instrText xml:space="preserve"> = 0 "nvt" </w:instrText>
+            </w:r>
+            <w:r>
+              <w:fldChar w:fldCharType="begin"/>
+            </w:r>
+            <w:r>
+              <w:instrText xml:space="preserve"> MERGEFIELD twelveVoltTurns </w:instrText>
+            </w:r>
+            <w:r>
+              <w:fldChar w:fldCharType="separate"/>
+            </w:r>
+            <w:r>
+              <w:rPr>
+                <w:noProof/>
+              </w:rPr>
+              <w:instrText>24</w:instrText>
+            </w:r>
+            <w:r>
+              <w:rPr>
+                <w:noProof/>
+              </w:rPr>
+              <w:fldChar w:fldCharType="end"/>
+            </w:r>
+            <w:r>
+              <w:instrText xml:space="preserve"> </w:instrText>
+            </w:r>
+            <w:r>
+              <w:fldChar w:fldCharType="separate"/>
+            </w:r>
+            <w:r>
+              <w:rPr>
+                <w:noProof/>
+              </w:rPr>
+              <w:t>nvt</w:t>
+            </w:r>
+            <w:r>
+              <w:fldChar w:fldCharType="end"/>
+            </w:r>
+          </w:p>
+        </w:tc>
+      </w:tr>
+      <w:tr>
+        <w:tc>
+          <w:tcPr>
+            <w:tcW w:w="4522" w:type="dxa"/>
+            <w:shd w:val="clear" w:color="auto" w:fill="D9D9D9" w:themeFill="background1" w:themeFillShade="D9"/>
+          </w:tcPr>
+          <w:p>
+            <w:r>
+              <w:t>12,6 volt draaddiameter</w:t>
+            </w:r>
+          </w:p>
+        </w:tc>
+        <w:tc>
+          <w:tcPr>
+            <w:tcW w:w="4540" w:type="dxa"/>
+            <w:shd w:val="clear" w:color="auto" w:fill="FFFFFF" w:themeFill="background1"/>
+          </w:tcPr>
+          <w:p>
+            <w:pPr>
+              <w:jc w:val="right"/>
+            </w:pPr>
+            <w:r>
+              <w:fldChar w:fldCharType="begin"/>
+            </w:r>
+            <w:r>
+              <w:instrText xml:space="preserve"> IF </w:instrText>
+            </w:r>
+            <w:r>
+              <w:fldChar w:fldCharType="begin"/>
+            </w:r>
+            <w:r>
+              <w:instrText xml:space="preserve"> MERGEFIELD </w:instrText>
+            </w:r>
+            <w:r>
+              <w:instrText>twelve</w:instrText>
+            </w:r>
+            <w:r>
+              <w:instrText xml:space="preserve">VoltWireSize </w:instrText>
+            </w:r>
+            <w:r>
+              <w:fldChar w:fldCharType="separate"/>
+            </w:r>
+            <w:r>
+              <w:rPr>
+                <w:noProof/>
+              </w:rPr>
+              <w:instrText>0</w:instrText>
+            </w:r>
+            <w:r>
+              <w:rPr>
+                <w:noProof/>
+              </w:rPr>
+              <w:fldChar w:fldCharType="end"/>
+            </w:r>
+            <w:r>
+              <w:instrText xml:space="preserve"> = 0 "nvt" </w:instrText>
+            </w:r>
+            <w:r>
+              <w:fldChar w:fldCharType="begin"/>
+            </w:r>
+            <w:r>
+              <w:instrText xml:space="preserve"> MERGEFIELD twelveVoltWireSize </w:instrText>
+            </w:r>
+            <w:r>
+              <w:fldChar w:fldCharType="separate"/>
+            </w:r>
+            <w:r>
+              <w:rPr>
+                <w:noProof/>
+              </w:rPr>
+              <w:instrText>0,5</w:instrText>
+            </w:r>
+            <w:r>
+              <w:rPr>
+                <w:noProof/>
+              </w:rPr>
+              <w:fldChar w:fldCharType="end"/>
+            </w:r>
+            <w:r>
+              <w:instrText xml:space="preserve"> </w:instrText>
+            </w:r>
+            <w:r>
+              <w:fldChar w:fldCharType="separate"/>
+            </w:r>
+            <w:r>
+              <w:rPr>
+                <w:noProof/>
+              </w:rPr>
+              <w:t>nvt</w:t>
+            </w:r>
+            <w:r>
+              <w:fldChar w:fldCharType="end"/>
+            </w:r>
+          </w:p>
+        </w:tc>
+      </w:tr>
+      <w:tr>
+        <w:tc>
+          <w:tcPr>
+            <w:tcW w:w="4522" w:type="dxa"/>
+            <w:shd w:val="clear" w:color="auto" w:fill="D9D9D9" w:themeFill="background1" w:themeFillShade="D9"/>
+          </w:tcPr>
+          <w:p>
+            <w:r>
+              <w:t>12,6 volt middenaftakking op wikkeling</w:t>
+            </w:r>
+          </w:p>
+        </w:tc>
+        <w:tc>
+          <w:tcPr>
+            <w:tcW w:w="4540" w:type="dxa"/>
+            <w:shd w:val="clear" w:color="auto" w:fill="FFFFFF" w:themeFill="background1"/>
+          </w:tcPr>
+          <w:p>
+            <w:pPr>
+              <w:jc w:val="right"/>
+            </w:pPr>
+            <w:r>
+              <w:fldChar w:fldCharType="begin"/>
+            </w:r>
+            <w:r>
+              <w:instrText xml:space="preserve"> IF </w:instrText>
+            </w:r>
+            <w:r>
+              <w:fldChar w:fldCharType="begin"/>
+            </w:r>
+            <w:r>
+              <w:instrText xml:space="preserve"> MERGEFIELD </w:instrText>
+            </w:r>
+            <w:r>
+              <w:instrText>twelve</w:instrText>
+            </w:r>
+            <w:r>
+              <w:instrText xml:space="preserve">VoltCenterTap </w:instrText>
+            </w:r>
+            <w:r>
+              <w:fldChar w:fldCharType="separate"/>
+            </w:r>
+            <w:r>
+              <w:rPr>
+                <w:noProof/>
+              </w:rPr>
+              <w:instrText>0</w:instrText>
+            </w:r>
+            <w:r>
+              <w:rPr>
+                <w:noProof/>
+              </w:rPr>
+              <w:fldChar w:fldCharType="end"/>
+            </w:r>
+            <w:r>
+              <w:instrText xml:space="preserve"> = 0 "nvt" </w:instrText>
+            </w:r>
+            <w:r>
+              <w:fldChar w:fldCharType="begin"/>
+            </w:r>
+            <w:r>
+              <w:instrText xml:space="preserve"> MERGEFIELD twelveVoltCenterTap </w:instrText>
+            </w:r>
+            <w:r>
+              <w:fldChar w:fldCharType="separate"/>
+            </w:r>
+            <w:r>
+              <w:rPr>
+                <w:noProof/>
+              </w:rPr>
+              <w:instrText>12</w:instrText>
+            </w:r>
+            <w:r>
+              <w:rPr>
+                <w:noProof/>
+              </w:rPr>
+              <w:fldChar w:fldCharType="end"/>
+            </w:r>
+            <w:r>
+              <w:instrText xml:space="preserve"> </w:instrText>
+            </w:r>
+            <w:r>
+              <w:fldChar w:fldCharType="separate"/>
+            </w:r>
+            <w:r>
+              <w:rPr>
+                <w:noProof/>
+              </w:rPr>
+              <w:t>nvt</w:t>
+            </w:r>
+            <w:r>
+              <w:fldChar w:fldCharType="end"/>
+            </w:r>
+          </w:p>
+        </w:tc>
+      </w:tr>
+      <w:tr>
+        <w:tc>
+          <w:tcPr>
+            <w:tcW w:w="4522" w:type="dxa"/>
             <w:shd w:val="clear" w:color="auto" w:fill="D9D9D9" w:themeFill="background1" w:themeFillShade="D9"/>
           </w:tcPr>
           <w:p/>
         </w:tc>
         <w:tc>
           <w:tcPr>
-            <w:tcW w:w="4606" w:type="dxa"/>
-            <w:shd w:val="clear" w:color="auto" w:fill="FFFFFF" w:themeFill="background1"/>
-          </w:tcPr>
-          <w:p>
-            <w:pPr>
-              <w:jc w:val="right"/>
-            </w:pPr>
-          </w:p>
-        </w:tc>
-      </w:tr>
-      <w:tr>
-        <w:tc>
-          <w:tcPr>
-            <w:tcW w:w="4606" w:type="dxa"/>
+            <w:tcW w:w="4540" w:type="dxa"/>
+            <w:shd w:val="clear" w:color="auto" w:fill="FFFFFF" w:themeFill="background1"/>
+          </w:tcPr>
+          <w:p>
+            <w:pPr>
+              <w:jc w:val="right"/>
+            </w:pPr>
+          </w:p>
+        </w:tc>
+      </w:tr>
+      <w:tr>
+        <w:tc>
+          <w:tcPr>
+            <w:tcW w:w="4522" w:type="dxa"/>
             <w:shd w:val="clear" w:color="auto" w:fill="D9D9D9" w:themeFill="background1" w:themeFillShade="D9"/>
           </w:tcPr>
           <w:p>
@@ -1159,7 +2083,7 @@
         </w:tc>
         <w:tc>
           <w:tcPr>
-            <w:tcW w:w="4606" w:type="dxa"/>
+            <w:tcW w:w="4540" w:type="dxa"/>
             <w:shd w:val="clear" w:color="auto" w:fill="FFFFFF" w:themeFill="background1"/>
           </w:tcPr>
           <w:p>
@@ -1180,7 +2104,7 @@
       <w:tr>
         <w:tc>
           <w:tcPr>
-            <w:tcW w:w="4606" w:type="dxa"/>
+            <w:tcW w:w="4522" w:type="dxa"/>
             <w:shd w:val="clear" w:color="auto" w:fill="D9D9D9" w:themeFill="background1" w:themeFillShade="D9"/>
           </w:tcPr>
           <w:p>
@@ -1200,7 +2124,7 @@
         </w:tc>
         <w:tc>
           <w:tcPr>
-            <w:tcW w:w="4606" w:type="dxa"/>
+            <w:tcW w:w="4540" w:type="dxa"/>
             <w:shd w:val="clear" w:color="auto" w:fill="FFFFFF" w:themeFill="background1"/>
           </w:tcPr>
           <w:p>
@@ -1221,7 +2145,7 @@
       <w:tr>
         <w:tc>
           <w:tcPr>
-            <w:tcW w:w="4606" w:type="dxa"/>
+            <w:tcW w:w="4522" w:type="dxa"/>
             <w:shd w:val="clear" w:color="auto" w:fill="D9D9D9" w:themeFill="background1" w:themeFillShade="D9"/>
           </w:tcPr>
           <w:p>
@@ -1241,28 +2165,98 @@
         </w:tc>
         <w:tc>
           <w:tcPr>
-            <w:tcW w:w="4606" w:type="dxa"/>
-            <w:shd w:val="clear" w:color="auto" w:fill="FFFFFF" w:themeFill="background1"/>
-          </w:tcPr>
-          <w:p>
-            <w:pPr>
-              <w:jc w:val="right"/>
-            </w:pPr>
-            <w:fldSimple w:instr=" MERGEFIELD fiveVoltTurnSpace ">
-              <w:r>
-                <w:rPr>
-                  <w:noProof/>
-                </w:rPr>
-                <w:t>0,27</w:t>
-              </w:r>
-            </w:fldSimple>
-          </w:p>
-        </w:tc>
-      </w:tr>
-      <w:tr>
-        <w:tc>
-          <w:tcPr>
-            <w:tcW w:w="4606" w:type="dxa"/>
+            <w:tcW w:w="4540" w:type="dxa"/>
+            <w:shd w:val="clear" w:color="auto" w:fill="FFFFFF" w:themeFill="background1"/>
+          </w:tcPr>
+          <w:p>
+            <w:pPr>
+              <w:jc w:val="right"/>
+            </w:pPr>
+            <w:r>
+              <w:fldChar w:fldCharType="begin"/>
+            </w:r>
+            <w:r>
+              <w:instrText xml:space="preserve"> IF </w:instrText>
+            </w:r>
+            <w:r>
+              <w:fldChar w:fldCharType="begin"/>
+            </w:r>
+            <w:r>
+              <w:instrText xml:space="preserve"> MERGEFIELD </w:instrText>
+            </w:r>
+            <w:r>
+              <w:instrText>five</w:instrText>
+            </w:r>
+            <w:r>
+              <w:instrText>Volt</w:instrText>
+            </w:r>
+            <w:r>
+              <w:instrText>TurnSpace</w:instrText>
+            </w:r>
+            <w:r>
+              <w:instrText xml:space="preserve"> </w:instrText>
+            </w:r>
+            <w:r>
+              <w:fldChar w:fldCharType="separate"/>
+            </w:r>
+            <w:r>
+              <w:rPr>
+                <w:noProof/>
+              </w:rPr>
+              <w:instrText>0,27</w:instrText>
+            </w:r>
+            <w:r>
+              <w:rPr>
+                <w:noProof/>
+              </w:rPr>
+              <w:fldChar w:fldCharType="end"/>
+            </w:r>
+            <w:r>
+              <w:instrText xml:space="preserve"> = 0 "nvt" </w:instrText>
+            </w:r>
+            <w:r>
+              <w:fldChar w:fldCharType="begin"/>
+            </w:r>
+            <w:r>
+              <w:instrText xml:space="preserve"> MERGEFIELD fiveVoltTurnSpace </w:instrText>
+            </w:r>
+            <w:r>
+              <w:fldChar w:fldCharType="separate"/>
+            </w:r>
+            <w:r>
+              <w:rPr>
+                <w:noProof/>
+              </w:rPr>
+              <w:instrText>0,27</w:instrText>
+            </w:r>
+            <w:r>
+              <w:rPr>
+                <w:noProof/>
+              </w:rPr>
+              <w:fldChar w:fldCharType="end"/>
+            </w:r>
+            <w:r>
+              <w:instrText xml:space="preserve"> </w:instrText>
+            </w:r>
+            <w:r>
+              <w:fldChar w:fldCharType="separate"/>
+            </w:r>
+            <w:r>
+              <w:rPr>
+                <w:noProof/>
+              </w:rPr>
+              <w:t>0,27</w:t>
+            </w:r>
+            <w:r>
+              <w:fldChar w:fldCharType="end"/>
+            </w:r>
+          </w:p>
+        </w:tc>
+      </w:tr>
+      <w:tr>
+        <w:tc>
+          <w:tcPr>
+            <w:tcW w:w="4522" w:type="dxa"/>
             <w:shd w:val="clear" w:color="auto" w:fill="D9D9D9" w:themeFill="background1" w:themeFillShade="D9"/>
           </w:tcPr>
           <w:p>
@@ -1288,28 +2282,92 @@
         </w:tc>
         <w:tc>
           <w:tcPr>
-            <w:tcW w:w="4606" w:type="dxa"/>
-            <w:shd w:val="clear" w:color="auto" w:fill="FFFFFF" w:themeFill="background1"/>
-          </w:tcPr>
-          <w:p>
-            <w:pPr>
-              <w:jc w:val="right"/>
-            </w:pPr>
-            <w:fldSimple w:instr=" MERGEFIELD sixVoltTurnSpace ">
-              <w:r>
-                <w:rPr>
-                  <w:noProof/>
-                </w:rPr>
-                <w:t>0,24</w:t>
-              </w:r>
-            </w:fldSimple>
-          </w:p>
-        </w:tc>
-      </w:tr>
-      <w:tr>
-        <w:tc>
-          <w:tcPr>
-            <w:tcW w:w="4606" w:type="dxa"/>
+            <w:tcW w:w="4540" w:type="dxa"/>
+            <w:shd w:val="clear" w:color="auto" w:fill="FFFFFF" w:themeFill="background1"/>
+          </w:tcPr>
+          <w:p>
+            <w:pPr>
+              <w:jc w:val="right"/>
+            </w:pPr>
+            <w:r>
+              <w:fldChar w:fldCharType="begin"/>
+            </w:r>
+            <w:r>
+              <w:instrText xml:space="preserve"> IF </w:instrText>
+            </w:r>
+            <w:r>
+              <w:fldChar w:fldCharType="begin"/>
+            </w:r>
+            <w:r>
+              <w:instrText xml:space="preserve"> MERGEFIELD </w:instrText>
+            </w:r>
+            <w:r>
+              <w:instrText>six</w:instrText>
+            </w:r>
+            <w:r>
+              <w:instrText xml:space="preserve">VoltTurnSpace </w:instrText>
+            </w:r>
+            <w:r>
+              <w:fldChar w:fldCharType="separate"/>
+            </w:r>
+            <w:r>
+              <w:rPr>
+                <w:noProof/>
+              </w:rPr>
+              <w:instrText>0,24</w:instrText>
+            </w:r>
+            <w:r>
+              <w:rPr>
+                <w:noProof/>
+              </w:rPr>
+              <w:fldChar w:fldCharType="end"/>
+            </w:r>
+            <w:r>
+              <w:instrText xml:space="preserve"> = 0 "nvt" </w:instrText>
+            </w:r>
+            <w:r>
+              <w:fldChar w:fldCharType="begin"/>
+            </w:r>
+            <w:r>
+              <w:instrText xml:space="preserve"> MERGEFIELD sixVoltTurnSpace </w:instrText>
+            </w:r>
+            <w:r>
+              <w:fldChar w:fldCharType="separate"/>
+            </w:r>
+            <w:r>
+              <w:rPr>
+                <w:noProof/>
+              </w:rPr>
+              <w:instrText>0,24</w:instrText>
+            </w:r>
+            <w:r>
+              <w:rPr>
+                <w:noProof/>
+              </w:rPr>
+              <w:fldChar w:fldCharType="end"/>
+            </w:r>
+            <w:r>
+              <w:instrText xml:space="preserve"> </w:instrText>
+            </w:r>
+            <w:r>
+              <w:fldChar w:fldCharType="separate"/>
+            </w:r>
+            <w:r>
+              <w:rPr>
+                <w:noProof/>
+              </w:rPr>
+              <w:t>0,24</w:t>
+            </w:r>
+            <w:r>
+              <w:fldChar w:fldCharType="end"/>
+            </w:r>
+          </w:p>
+        </w:tc>
+      </w:tr>
+      <w:tr>
+        <w:tc>
+          <w:tcPr>
+            <w:tcW w:w="4522" w:type="dxa"/>
             <w:shd w:val="clear" w:color="auto" w:fill="D9D9D9" w:themeFill="background1" w:themeFillShade="D9"/>
           </w:tcPr>
           <w:p>
@@ -1335,28 +2393,98 @@
         </w:tc>
         <w:tc>
           <w:tcPr>
-            <w:tcW w:w="4606" w:type="dxa"/>
-            <w:shd w:val="clear" w:color="auto" w:fill="FFFFFF" w:themeFill="background1"/>
-          </w:tcPr>
-          <w:p>
-            <w:pPr>
-              <w:jc w:val="right"/>
-            </w:pPr>
-            <w:fldSimple w:instr=" MERGEFIELD twelveVoltTurnSpace ">
-              <w:r>
-                <w:rPr>
-                  <w:noProof/>
-                </w:rPr>
-                <w:t>0,00</w:t>
-              </w:r>
-            </w:fldSimple>
-          </w:p>
-        </w:tc>
-      </w:tr>
-      <w:tr>
-        <w:tc>
-          <w:tcPr>
-            <w:tcW w:w="4606" w:type="dxa"/>
+            <w:tcW w:w="4540" w:type="dxa"/>
+            <w:shd w:val="clear" w:color="auto" w:fill="FFFFFF" w:themeFill="background1"/>
+          </w:tcPr>
+          <w:p>
+            <w:pPr>
+              <w:jc w:val="right"/>
+            </w:pPr>
+            <w:r>
+              <w:fldChar w:fldCharType="begin"/>
+            </w:r>
+            <w:r>
+              <w:instrText xml:space="preserve"> IF </w:instrText>
+            </w:r>
+            <w:r>
+              <w:fldChar w:fldCharType="begin"/>
+            </w:r>
+            <w:r>
+              <w:instrText xml:space="preserve"> MERGEFIELD </w:instrText>
+            </w:r>
+            <w:r>
+              <w:instrText>twelve</w:instrText>
+            </w:r>
+            <w:r>
+              <w:instrText xml:space="preserve">VoltTurnSpace </w:instrText>
+            </w:r>
+            <w:r>
+              <w:fldChar w:fldCharType="separate"/>
+            </w:r>
+            <w:r>
+              <w:rPr>
+                <w:noProof/>
+              </w:rPr>
+              <w:instrText>0</w:instrText>
+            </w:r>
+            <w:r>
+              <w:rPr>
+                <w:noProof/>
+              </w:rPr>
+              <w:fldChar w:fldCharType="end"/>
+            </w:r>
+            <w:r>
+              <w:instrText xml:space="preserve"> = 0 "nvt" </w:instrText>
+            </w:r>
+            <w:r>
+              <w:fldChar w:fldCharType="begin"/>
+            </w:r>
+            <w:r>
+              <w:instrText xml:space="preserve"> MERGEFIELD </w:instrText>
+            </w:r>
+            <w:r>
+              <w:instrText>twelve</w:instrText>
+            </w:r>
+            <w:r>
+              <w:instrText xml:space="preserve">VoltTurnSpace </w:instrText>
+            </w:r>
+            <w:r>
+              <w:fldChar w:fldCharType="separate"/>
+            </w:r>
+            <w:r>
+              <w:rPr>
+                <w:noProof/>
+              </w:rPr>
+              <w:instrText>0,24</w:instrText>
+            </w:r>
+            <w:r>
+              <w:rPr>
+                <w:noProof/>
+              </w:rPr>
+              <w:fldChar w:fldCharType="end"/>
+            </w:r>
+            <w:r>
+              <w:instrText xml:space="preserve"> </w:instrText>
+            </w:r>
+            <w:r>
+              <w:fldChar w:fldCharType="separate"/>
+            </w:r>
+            <w:r>
+              <w:rPr>
+                <w:noProof/>
+              </w:rPr>
+              <w:t>nvt</w:t>
+            </w:r>
+            <w:r>
+              <w:fldChar w:fldCharType="end"/>
+            </w:r>
+          </w:p>
+        </w:tc>
+      </w:tr>
+      <w:tr>
+        <w:tc>
+          <w:tcPr>
+            <w:tcW w:w="4522" w:type="dxa"/>
             <w:shd w:val="clear" w:color="auto" w:fill="D9D9D9" w:themeFill="background1" w:themeFillShade="D9"/>
           </w:tcPr>
           <w:p>
@@ -1376,7 +2504,7 @@
         </w:tc>
         <w:tc>
           <w:tcPr>
-            <w:tcW w:w="4606" w:type="dxa"/>
+            <w:tcW w:w="4540" w:type="dxa"/>
             <w:shd w:val="clear" w:color="auto" w:fill="FFFFFF" w:themeFill="background1"/>
           </w:tcPr>
           <w:p>
@@ -1397,7 +2525,7 @@
       <w:tr>
         <w:tc>
           <w:tcPr>
-            <w:tcW w:w="4606" w:type="dxa"/>
+            <w:tcW w:w="4522" w:type="dxa"/>
             <w:shd w:val="clear" w:color="auto" w:fill="D9D9D9" w:themeFill="background1" w:themeFillShade="D9"/>
           </w:tcPr>
           <w:p>
@@ -1408,7 +2536,7 @@
         </w:tc>
         <w:tc>
           <w:tcPr>
-            <w:tcW w:w="4606" w:type="dxa"/>
+            <w:tcW w:w="4540" w:type="dxa"/>
             <w:shd w:val="clear" w:color="auto" w:fill="FFFFFF" w:themeFill="background1"/>
           </w:tcPr>
           <w:p>
@@ -1841,7 +2969,6 @@
   <w:style w:type="character" w:default="1" w:styleId="Standaardalinea-lettertype">
     <w:name w:val="Default Paragraph Font"/>
     <w:uiPriority w:val="1"/>
-    <w:semiHidden/>
     <w:unhideWhenUsed/>
   </w:style>
   <w:style w:type="table" w:default="1" w:styleId="Standaardtabel">

</xml_diff>